<commit_message>
[supervisor] fix(contact): use the new email and remove the phone number (#306)
Closes #306

Agent-Role: supervisor
Co-Authored-By: Claude Sonnet 5.5 <noreply@anthropic.com>
</commit_message>
<xml_diff>
--- a/reference/resume/Rohan_Resume_v26.docx
+++ b/reference/resume/Rohan_Resume_v26.docx
@@ -70,23 +70,23 @@
           <w:sz w:val="19"/>
           <w:szCs w:val="19"/>
         </w:rPr>
-        <w:t>● (</w:t>
-      </w:r>
-      <w:r>
-        <w:rPr>
-          <w:color w:val="555555"/>
-          <w:sz w:val="19"/>
-          <w:szCs w:val="19"/>
-        </w:rPr>
-        <w:t>240) 495-</w:t>
-      </w:r>
-      <w:r>
-        <w:rPr>
-          <w:color w:val="555555"/>
-          <w:sz w:val="19"/>
-          <w:szCs w:val="19"/>
-        </w:rPr>
-        <w:t>9682 ●</w:t>
+        <w:t>●</w:t>
+      </w:r>
+      <w:r>
+        <w:rPr>
+          <w:color w:val="555555"/>
+          <w:sz w:val="19"/>
+          <w:szCs w:val="19"/>
+        </w:rPr>
+        <w:t/>
+      </w:r>
+      <w:r>
+        <w:rPr>
+          <w:color w:val="555555"/>
+          <w:sz w:val="19"/>
+          <w:szCs w:val="19"/>
+        </w:rPr>
+        <w:t/>
       </w:r>
       <w:r>
         <w:rPr>
@@ -104,7 +104,7 @@
             <w:szCs w:val="19"/>
             <w:u w:val="single"/>
           </w:rPr>
-          <w:t>rohanjain2312@gmail.com</w:t>
+          <w:t>jainrohan2312@gmail.com</w:t>
         </w:r>
       </w:hyperlink>
       <w:r>

</xml_diff>

<commit_message>
[supervisor] fix(contact): use the new email and remove the phone number (#306) (#307)
Closes #306

Client request (critical, bots): replace the contact email and remove
the phone number everywhere.

- Email changed in site.json, resume.json (all three PDFs rebuild from
it), docs, mocks, tests and the reference docx.
- Phone removed from content, schemas, Contact, résumé header, brief,
claims checks, tests and docs. R-305 now means no phone anywhere and no
telephone field.
- Claims check allowlist gains `1` on /404 and `01` on / (they were
passing only through the phone digits).
- Screenshots recaptured.

Checked: vitest 259 pass, test:frontend 189 pass, test:e2e 97 pass,
lint, lint:css, lint:html, lint:copy, docs:lint, format:check, build
with check-claims OK.

🤖 Generated with [Claude Code](https://claude.com/claude-code)

---------

Co-authored-by: Claude Sonnet 5.5 <noreply@anthropic.com>
</commit_message>
<xml_diff>
--- a/reference/resume/Rohan_Resume_v26.docx
+++ b/reference/resume/Rohan_Resume_v26.docx
@@ -70,23 +70,23 @@
           <w:sz w:val="19"/>
           <w:szCs w:val="19"/>
         </w:rPr>
-        <w:t>● (</w:t>
-      </w:r>
-      <w:r>
-        <w:rPr>
-          <w:color w:val="555555"/>
-          <w:sz w:val="19"/>
-          <w:szCs w:val="19"/>
-        </w:rPr>
-        <w:t>240) 495-</w:t>
-      </w:r>
-      <w:r>
-        <w:rPr>
-          <w:color w:val="555555"/>
-          <w:sz w:val="19"/>
-          <w:szCs w:val="19"/>
-        </w:rPr>
-        <w:t>9682 ●</w:t>
+        <w:t>●</w:t>
+      </w:r>
+      <w:r>
+        <w:rPr>
+          <w:color w:val="555555"/>
+          <w:sz w:val="19"/>
+          <w:szCs w:val="19"/>
+        </w:rPr>
+        <w:t/>
+      </w:r>
+      <w:r>
+        <w:rPr>
+          <w:color w:val="555555"/>
+          <w:sz w:val="19"/>
+          <w:szCs w:val="19"/>
+        </w:rPr>
+        <w:t/>
       </w:r>
       <w:r>
         <w:rPr>
@@ -104,7 +104,7 @@
             <w:szCs w:val="19"/>
             <w:u w:val="single"/>
           </w:rPr>
-          <w:t>rohanjain2312@gmail.com</w:t>
+          <w:t>jainrohan2312@gmail.com</w:t>
         </w:r>
       </w:hyperlink>
       <w:r>

</xml_diff>